<commit_message>
Simplifie la présentation des livrables
</commit_message>
<xml_diff>
--- a/docs/Manuel_utilisation_plateforme_CDC.docx
+++ b/docs/Manuel_utilisation_plateforme_CDC.docx
@@ -31,7 +31,7 @@
                 <w:noProof/>
               </w:rPr>
               <w:drawing>
-                <wp:inline distT="0" distB="0" distL="0" distR="0" wp14:anchorId="20102559" wp14:editId="26758B5E">
+                <wp:inline distT="0" distB="0" distL="0" distR="0" wp14:anchorId="2C6A288F" wp14:editId="7FA2B782">
                   <wp:extent cx="2148840" cy="580187"/>
                   <wp:effectExtent l="0" t="0" r="0" b="0"/>
                   <wp:docPr id="1" name="Picture 1"/>
@@ -82,7 +82,7 @@
                 <w:noProof/>
               </w:rPr>
               <w:drawing>
-                <wp:inline distT="0" distB="0" distL="0" distR="0" wp14:anchorId="06706C4B" wp14:editId="21F7363D">
+                <wp:inline distT="0" distB="0" distL="0" distR="0" wp14:anchorId="2066F3F5" wp14:editId="28A9D00D">
                   <wp:extent cx="2057400" cy="478289"/>
                   <wp:effectExtent l="0" t="0" r="0" b="0"/>
                   <wp:docPr id="2" name="Picture 2"/>
@@ -349,7 +349,7 @@
         <w:rPr>
           <w:i/>
         </w:rPr>
-        <w:t>Version 1.0 — septembre 2026</w:t>
+        <w:t>Septembre 2026</w:t>
       </w:r>
     </w:p>
     <w:p>
@@ -361,7 +361,7 @@
       <w:pPr>
         <w:pStyle w:val="Heading1"/>
       </w:pPr>
-      <w:bookmarkStart w:id="0" w:name="_Toc239369601"/>
+      <w:bookmarkStart w:id="0" w:name="_Toc239372038"/>
       <w:r>
         <w:lastRenderedPageBreak/>
         <w:t>Informations sur le document</w:t>
@@ -404,35 +404,6 @@
           <w:p>
             <w:r>
               <w:t>Manuel d’utilisation de la plateforme documentaire événementielle</w:t>
-            </w:r>
-          </w:p>
-        </w:tc>
-      </w:tr>
-      <w:tr>
-        <w:trPr>
-          <w:jc w:val="center"/>
-        </w:trPr>
-        <w:tc>
-          <w:tcPr>
-            <w:tcW w:w="4929" w:type="dxa"/>
-            <w:shd w:val="clear" w:color="auto" w:fill="EAF3F8"/>
-          </w:tcPr>
-          <w:p>
-            <w:r>
-              <w:rPr>
-                <w:b/>
-              </w:rPr>
-              <w:t>Version</w:t>
-            </w:r>
-          </w:p>
-        </w:tc>
-        <w:tc>
-          <w:tcPr>
-            <w:tcW w:w="4929" w:type="dxa"/>
-          </w:tcPr>
-          <w:p>
-            <w:r>
-              <w:t>1.0</w:t>
             </w:r>
           </w:p>
         </w:tc>
@@ -509,7 +480,7 @@
               <w:rPr>
                 <w:b/>
               </w:rPr>
-              <w:t>Auteur et propriétaire</w:t>
+              <w:t>Auteur</w:t>
             </w:r>
           </w:p>
         </w:tc>
@@ -558,7 +529,7 @@
       <w:pPr>
         <w:pStyle w:val="Heading2"/>
       </w:pPr>
-      <w:bookmarkStart w:id="1" w:name="_Toc239369602"/>
+      <w:bookmarkStart w:id="1" w:name="_Toc239372039"/>
       <w:r>
         <w:t>Objet du manuel</w:t>
       </w:r>
@@ -569,43 +540,11 @@
         <w:t>Ce manuel explique l’utilisation fonctionnelle de la plateforme, depuis l’authentification jusqu’au suivi des traitements asynchrones. Il présente également les interfaces techniques nécessaires à la démonstration et au diagnostic du pipeline de capture des changements.</w:t>
       </w:r>
     </w:p>
-    <w:tbl>
-      <w:tblPr>
-        <w:tblW w:w="0" w:type="auto"/>
-        <w:jc w:val="center"/>
-        <w:tblLook w:val="04A0" w:firstRow="1" w:lastRow="0" w:firstColumn="1" w:lastColumn="0" w:noHBand="0" w:noVBand="1"/>
-      </w:tblPr>
-      <w:tblGrid>
-        <w:gridCol w:w="9858"/>
-      </w:tblGrid>
-      <w:tr>
-        <w:trPr>
-          <w:jc w:val="center"/>
-        </w:trPr>
-        <w:tc>
-          <w:tcPr>
-            <w:tcW w:w="9858" w:type="dxa"/>
-            <w:shd w:val="clear" w:color="auto" w:fill="EAF3F8"/>
-          </w:tcPr>
-          <w:p>
-            <w:r>
-              <w:rPr>
-                <w:b/>
-              </w:rPr>
-              <w:t xml:space="preserve">Attribution — </w:t>
-            </w:r>
-            <w:r>
-              <w:t>Ce document et le projet associé constituent un travail original de Lazim Wassim. La provenance peut être vérifiée dans les métadonnées du document, son pied de page et le dépôt GitHub officiel.</w:t>
-            </w:r>
-          </w:p>
-        </w:tc>
-      </w:tr>
-    </w:tbl>
     <w:p>
       <w:pPr>
         <w:pStyle w:val="Heading1"/>
       </w:pPr>
-      <w:bookmarkStart w:id="2" w:name="_Toc239369603"/>
+      <w:bookmarkStart w:id="2" w:name="_Toc239372040"/>
       <w:r>
         <w:t>Table des matières</w:t>
       </w:r>
@@ -630,7 +569,7 @@
       <w:r>
         <w:fldChar w:fldCharType="separate"/>
       </w:r>
-      <w:hyperlink w:anchor="_Toc239369601" w:history="1">
+      <w:hyperlink w:anchor="_Toc239372038" w:history="1">
         <w:r>
           <w:rPr>
             <w:rStyle w:val="Hyperlink"/>
@@ -657,7 +596,7 @@
             <w:noProof/>
             <w:webHidden/>
           </w:rPr>
-          <w:instrText xml:space="preserve"> PAGEREF _Toc239369601 \h </w:instrText>
+          <w:instrText xml:space="preserve"> PAGEREF _Toc239372038 \h </w:instrText>
         </w:r>
         <w:r>
           <w:rPr>
@@ -698,7 +637,7 @@
           <w:noProof/>
         </w:rPr>
       </w:pPr>
-      <w:hyperlink w:anchor="_Toc239369602" w:history="1">
+      <w:hyperlink w:anchor="_Toc239372039" w:history="1">
         <w:r>
           <w:rPr>
             <w:rStyle w:val="Hyperlink"/>
@@ -725,7 +664,7 @@
             <w:noProof/>
             <w:webHidden/>
           </w:rPr>
-          <w:instrText xml:space="preserve"> PAGEREF _Toc239369602 \h </w:instrText>
+          <w:instrText xml:space="preserve"> PAGEREF _Toc239372039 \h </w:instrText>
         </w:r>
         <w:r>
           <w:rPr>
@@ -766,7 +705,7 @@
           <w:noProof/>
         </w:rPr>
       </w:pPr>
-      <w:hyperlink w:anchor="_Toc239369603" w:history="1">
+      <w:hyperlink w:anchor="_Toc239372040" w:history="1">
         <w:r>
           <w:rPr>
             <w:rStyle w:val="Hyperlink"/>
@@ -793,7 +732,7 @@
             <w:noProof/>
             <w:webHidden/>
           </w:rPr>
-          <w:instrText xml:space="preserve"> PAGEREF _Toc239369603 \h </w:instrText>
+          <w:instrText xml:space="preserve"> PAGEREF _Toc239372040 \h </w:instrText>
         </w:r>
         <w:r>
           <w:rPr>
@@ -834,7 +773,7 @@
           <w:noProof/>
         </w:rPr>
       </w:pPr>
-      <w:hyperlink w:anchor="_Toc239369604" w:history="1">
+      <w:hyperlink w:anchor="_Toc239372041" w:history="1">
         <w:r>
           <w:rPr>
             <w:rStyle w:val="Hyperlink"/>
@@ -861,7 +800,7 @@
             <w:noProof/>
             <w:webHidden/>
           </w:rPr>
-          <w:instrText xml:space="preserve"> PAGEREF _Toc239369604 \h </w:instrText>
+          <w:instrText xml:space="preserve"> PAGEREF _Toc239372041 \h </w:instrText>
         </w:r>
         <w:r>
           <w:rPr>
@@ -902,7 +841,7 @@
           <w:noProof/>
         </w:rPr>
       </w:pPr>
-      <w:hyperlink w:anchor="_Toc239369605" w:history="1">
+      <w:hyperlink w:anchor="_Toc239372042" w:history="1">
         <w:r>
           <w:rPr>
             <w:rStyle w:val="Hyperlink"/>
@@ -929,7 +868,7 @@
             <w:noProof/>
             <w:webHidden/>
           </w:rPr>
-          <w:instrText xml:space="preserve"> PAGEREF _Toc239369605 \h </w:instrText>
+          <w:instrText xml:space="preserve"> PAGEREF _Toc239372042 \h </w:instrText>
         </w:r>
         <w:r>
           <w:rPr>
@@ -970,7 +909,7 @@
           <w:noProof/>
         </w:rPr>
       </w:pPr>
-      <w:hyperlink w:anchor="_Toc239369606" w:history="1">
+      <w:hyperlink w:anchor="_Toc239372043" w:history="1">
         <w:r>
           <w:rPr>
             <w:rStyle w:val="Hyperlink"/>
@@ -997,7 +936,7 @@
             <w:noProof/>
             <w:webHidden/>
           </w:rPr>
-          <w:instrText xml:space="preserve"> PAGEREF _Toc239369606 \h </w:instrText>
+          <w:instrText xml:space="preserve"> PAGEREF _Toc239372043 \h </w:instrText>
         </w:r>
         <w:r>
           <w:rPr>
@@ -1038,7 +977,7 @@
           <w:noProof/>
         </w:rPr>
       </w:pPr>
-      <w:hyperlink w:anchor="_Toc239369607" w:history="1">
+      <w:hyperlink w:anchor="_Toc239372044" w:history="1">
         <w:r>
           <w:rPr>
             <w:rStyle w:val="Hyperlink"/>
@@ -1065,7 +1004,7 @@
             <w:noProof/>
             <w:webHidden/>
           </w:rPr>
-          <w:instrText xml:space="preserve"> PAGEREF _Toc239369607 \h </w:instrText>
+          <w:instrText xml:space="preserve"> PAGEREF _Toc239372044 \h </w:instrText>
         </w:r>
         <w:r>
           <w:rPr>
@@ -1106,7 +1045,7 @@
           <w:noProof/>
         </w:rPr>
       </w:pPr>
-      <w:hyperlink w:anchor="_Toc239369608" w:history="1">
+      <w:hyperlink w:anchor="_Toc239372045" w:history="1">
         <w:r>
           <w:rPr>
             <w:rStyle w:val="Hyperlink"/>
@@ -1133,7 +1072,7 @@
             <w:noProof/>
             <w:webHidden/>
           </w:rPr>
-          <w:instrText xml:space="preserve"> PAGEREF _Toc239369608 \h </w:instrText>
+          <w:instrText xml:space="preserve"> PAGEREF _Toc239372045 \h </w:instrText>
         </w:r>
         <w:r>
           <w:rPr>
@@ -1174,7 +1113,7 @@
           <w:noProof/>
         </w:rPr>
       </w:pPr>
-      <w:hyperlink w:anchor="_Toc239369609" w:history="1">
+      <w:hyperlink w:anchor="_Toc239372046" w:history="1">
         <w:r>
           <w:rPr>
             <w:rStyle w:val="Hyperlink"/>
@@ -1201,7 +1140,7 @@
             <w:noProof/>
             <w:webHidden/>
           </w:rPr>
-          <w:instrText xml:space="preserve"> PAGEREF _Toc239369609 \h </w:instrText>
+          <w:instrText xml:space="preserve"> PAGEREF _Toc239372046 \h </w:instrText>
         </w:r>
         <w:r>
           <w:rPr>
@@ -1242,7 +1181,7 @@
           <w:noProof/>
         </w:rPr>
       </w:pPr>
-      <w:hyperlink w:anchor="_Toc239369610" w:history="1">
+      <w:hyperlink w:anchor="_Toc239372047" w:history="1">
         <w:r>
           <w:rPr>
             <w:rStyle w:val="Hyperlink"/>
@@ -1269,7 +1208,7 @@
             <w:noProof/>
             <w:webHidden/>
           </w:rPr>
-          <w:instrText xml:space="preserve"> PAGEREF _Toc239369610 \h </w:instrText>
+          <w:instrText xml:space="preserve"> PAGEREF _Toc239372047 \h </w:instrText>
         </w:r>
         <w:r>
           <w:rPr>
@@ -1310,7 +1249,7 @@
           <w:noProof/>
         </w:rPr>
       </w:pPr>
-      <w:hyperlink w:anchor="_Toc239369611" w:history="1">
+      <w:hyperlink w:anchor="_Toc239372048" w:history="1">
         <w:r>
           <w:rPr>
             <w:rStyle w:val="Hyperlink"/>
@@ -1337,7 +1276,7 @@
             <w:noProof/>
             <w:webHidden/>
           </w:rPr>
-          <w:instrText xml:space="preserve"> PAGEREF _Toc239369611 \h </w:instrText>
+          <w:instrText xml:space="preserve"> PAGEREF _Toc239372048 \h </w:instrText>
         </w:r>
         <w:r>
           <w:rPr>
@@ -1378,7 +1317,7 @@
           <w:noProof/>
         </w:rPr>
       </w:pPr>
-      <w:hyperlink w:anchor="_Toc239369612" w:history="1">
+      <w:hyperlink w:anchor="_Toc239372049" w:history="1">
         <w:r>
           <w:rPr>
             <w:rStyle w:val="Hyperlink"/>
@@ -1405,7 +1344,7 @@
             <w:noProof/>
             <w:webHidden/>
           </w:rPr>
-          <w:instrText xml:space="preserve"> PAGEREF _Toc239369612 \h </w:instrText>
+          <w:instrText xml:space="preserve"> PAGEREF _Toc239372049 \h </w:instrText>
         </w:r>
         <w:r>
           <w:rPr>
@@ -1446,7 +1385,7 @@
           <w:noProof/>
         </w:rPr>
       </w:pPr>
-      <w:hyperlink w:anchor="_Toc239369613" w:history="1">
+      <w:hyperlink w:anchor="_Toc239372050" w:history="1">
         <w:r>
           <w:rPr>
             <w:rStyle w:val="Hyperlink"/>
@@ -1473,7 +1412,7 @@
             <w:noProof/>
             <w:webHidden/>
           </w:rPr>
-          <w:instrText xml:space="preserve"> PAGEREF _Toc239369613 \h </w:instrText>
+          <w:instrText xml:space="preserve"> PAGEREF _Toc239372050 \h </w:instrText>
         </w:r>
         <w:r>
           <w:rPr>
@@ -1514,7 +1453,7 @@
           <w:noProof/>
         </w:rPr>
       </w:pPr>
-      <w:hyperlink w:anchor="_Toc239369614" w:history="1">
+      <w:hyperlink w:anchor="_Toc239372051" w:history="1">
         <w:r>
           <w:rPr>
             <w:rStyle w:val="Hyperlink"/>
@@ -1541,7 +1480,7 @@
             <w:noProof/>
             <w:webHidden/>
           </w:rPr>
-          <w:instrText xml:space="preserve"> PAGEREF _Toc239369614 \h </w:instrText>
+          <w:instrText xml:space="preserve"> PAGEREF _Toc239372051 \h </w:instrText>
         </w:r>
         <w:r>
           <w:rPr>
@@ -1582,7 +1521,7 @@
           <w:noProof/>
         </w:rPr>
       </w:pPr>
-      <w:hyperlink w:anchor="_Toc239369615" w:history="1">
+      <w:hyperlink w:anchor="_Toc239372052" w:history="1">
         <w:r>
           <w:rPr>
             <w:rStyle w:val="Hyperlink"/>
@@ -1609,7 +1548,7 @@
             <w:noProof/>
             <w:webHidden/>
           </w:rPr>
-          <w:instrText xml:space="preserve"> PAGEREF _Toc239369615 \h </w:instrText>
+          <w:instrText xml:space="preserve"> PAGEREF _Toc239372052 \h </w:instrText>
         </w:r>
         <w:r>
           <w:rPr>
@@ -1650,7 +1589,7 @@
           <w:noProof/>
         </w:rPr>
       </w:pPr>
-      <w:hyperlink w:anchor="_Toc239369616" w:history="1">
+      <w:hyperlink w:anchor="_Toc239372053" w:history="1">
         <w:r>
           <w:rPr>
             <w:rStyle w:val="Hyperlink"/>
@@ -1677,7 +1616,7 @@
             <w:noProof/>
             <w:webHidden/>
           </w:rPr>
-          <w:instrText xml:space="preserve"> PAGEREF _Toc239369616 \h </w:instrText>
+          <w:instrText xml:space="preserve"> PAGEREF _Toc239372053 \h </w:instrText>
         </w:r>
         <w:r>
           <w:rPr>
@@ -1718,7 +1657,7 @@
           <w:noProof/>
         </w:rPr>
       </w:pPr>
-      <w:hyperlink w:anchor="_Toc239369617" w:history="1">
+      <w:hyperlink w:anchor="_Toc239372054" w:history="1">
         <w:r>
           <w:rPr>
             <w:rStyle w:val="Hyperlink"/>
@@ -1745,7 +1684,7 @@
             <w:noProof/>
             <w:webHidden/>
           </w:rPr>
-          <w:instrText xml:space="preserve"> PAGEREF _Toc239369617 \h </w:instrText>
+          <w:instrText xml:space="preserve"> PAGEREF _Toc239372054 \h </w:instrText>
         </w:r>
         <w:r>
           <w:rPr>
@@ -1786,7 +1725,7 @@
           <w:noProof/>
         </w:rPr>
       </w:pPr>
-      <w:hyperlink w:anchor="_Toc239369618" w:history="1">
+      <w:hyperlink w:anchor="_Toc239372055" w:history="1">
         <w:r>
           <w:rPr>
             <w:rStyle w:val="Hyperlink"/>
@@ -1813,7 +1752,7 @@
             <w:noProof/>
             <w:webHidden/>
           </w:rPr>
-          <w:instrText xml:space="preserve"> PAGEREF _Toc239369618 \h </w:instrText>
+          <w:instrText xml:space="preserve"> PAGEREF _Toc239372055 \h </w:instrText>
         </w:r>
         <w:r>
           <w:rPr>
@@ -1854,7 +1793,7 @@
           <w:noProof/>
         </w:rPr>
       </w:pPr>
-      <w:hyperlink w:anchor="_Toc239369619" w:history="1">
+      <w:hyperlink w:anchor="_Toc239372056" w:history="1">
         <w:r>
           <w:rPr>
             <w:rStyle w:val="Hyperlink"/>
@@ -1881,7 +1820,7 @@
             <w:noProof/>
             <w:webHidden/>
           </w:rPr>
-          <w:instrText xml:space="preserve"> PAGEREF _Toc239369619 \h </w:instrText>
+          <w:instrText xml:space="preserve"> PAGEREF _Toc239372056 \h </w:instrText>
         </w:r>
         <w:r>
           <w:rPr>
@@ -1922,7 +1861,7 @@
           <w:noProof/>
         </w:rPr>
       </w:pPr>
-      <w:hyperlink w:anchor="_Toc239369620" w:history="1">
+      <w:hyperlink w:anchor="_Toc239372057" w:history="1">
         <w:r>
           <w:rPr>
             <w:rStyle w:val="Hyperlink"/>
@@ -1949,7 +1888,7 @@
             <w:noProof/>
             <w:webHidden/>
           </w:rPr>
-          <w:instrText xml:space="preserve"> PAGEREF _Toc239369620 \h </w:instrText>
+          <w:instrText xml:space="preserve"> PAGEREF _Toc239372057 \h </w:instrText>
         </w:r>
         <w:r>
           <w:rPr>
@@ -1990,7 +1929,7 @@
           <w:noProof/>
         </w:rPr>
       </w:pPr>
-      <w:hyperlink w:anchor="_Toc239369621" w:history="1">
+      <w:hyperlink w:anchor="_Toc239372058" w:history="1">
         <w:r>
           <w:rPr>
             <w:rStyle w:val="Hyperlink"/>
@@ -2017,7 +1956,7 @@
             <w:noProof/>
             <w:webHidden/>
           </w:rPr>
-          <w:instrText xml:space="preserve"> PAGEREF _Toc239369621 \h </w:instrText>
+          <w:instrText xml:space="preserve"> PAGEREF _Toc239372058 \h </w:instrText>
         </w:r>
         <w:r>
           <w:rPr>
@@ -2058,7 +1997,7 @@
           <w:noProof/>
         </w:rPr>
       </w:pPr>
-      <w:hyperlink w:anchor="_Toc239369622" w:history="1">
+      <w:hyperlink w:anchor="_Toc239372059" w:history="1">
         <w:r>
           <w:rPr>
             <w:rStyle w:val="Hyperlink"/>
@@ -2085,7 +2024,7 @@
             <w:noProof/>
             <w:webHidden/>
           </w:rPr>
-          <w:instrText xml:space="preserve"> PAGEREF _Toc239369622 \h </w:instrText>
+          <w:instrText xml:space="preserve"> PAGEREF _Toc239372059 \h </w:instrText>
         </w:r>
         <w:r>
           <w:rPr>
@@ -2126,7 +2065,7 @@
           <w:noProof/>
         </w:rPr>
       </w:pPr>
-      <w:hyperlink w:anchor="_Toc239369623" w:history="1">
+      <w:hyperlink w:anchor="_Toc239372060" w:history="1">
         <w:r>
           <w:rPr>
             <w:rStyle w:val="Hyperlink"/>
@@ -2153,7 +2092,7 @@
             <w:noProof/>
             <w:webHidden/>
           </w:rPr>
-          <w:instrText xml:space="preserve"> PAGEREF _Toc239369623 \h </w:instrText>
+          <w:instrText xml:space="preserve"> PAGEREF _Toc239372060 \h </w:instrText>
         </w:r>
         <w:r>
           <w:rPr>
@@ -2194,7 +2133,7 @@
           <w:noProof/>
         </w:rPr>
       </w:pPr>
-      <w:hyperlink w:anchor="_Toc239369624" w:history="1">
+      <w:hyperlink w:anchor="_Toc239372061" w:history="1">
         <w:r>
           <w:rPr>
             <w:rStyle w:val="Hyperlink"/>
@@ -2221,7 +2160,7 @@
             <w:noProof/>
             <w:webHidden/>
           </w:rPr>
-          <w:instrText xml:space="preserve"> PAGEREF _Toc239369624 \h </w:instrText>
+          <w:instrText xml:space="preserve"> PAGEREF _Toc239372061 \h </w:instrText>
         </w:r>
         <w:r>
           <w:rPr>
@@ -2262,7 +2201,7 @@
           <w:noProof/>
         </w:rPr>
       </w:pPr>
-      <w:hyperlink w:anchor="_Toc239369625" w:history="1">
+      <w:hyperlink w:anchor="_Toc239372062" w:history="1">
         <w:r>
           <w:rPr>
             <w:rStyle w:val="Hyperlink"/>
@@ -2289,7 +2228,7 @@
             <w:noProof/>
             <w:webHidden/>
           </w:rPr>
-          <w:instrText xml:space="preserve"> PAGEREF _Toc239369625 \h </w:instrText>
+          <w:instrText xml:space="preserve"> PAGEREF _Toc239372062 \h </w:instrText>
         </w:r>
         <w:r>
           <w:rPr>
@@ -2330,7 +2269,7 @@
           <w:noProof/>
         </w:rPr>
       </w:pPr>
-      <w:hyperlink w:anchor="_Toc239369626" w:history="1">
+      <w:hyperlink w:anchor="_Toc239372063" w:history="1">
         <w:r>
           <w:rPr>
             <w:rStyle w:val="Hyperlink"/>
@@ -2357,7 +2296,7 @@
             <w:noProof/>
             <w:webHidden/>
           </w:rPr>
-          <w:instrText xml:space="preserve"> PAGEREF _Toc239369626 \h </w:instrText>
+          <w:instrText xml:space="preserve"> PAGEREF _Toc239372063 \h </w:instrText>
         </w:r>
         <w:r>
           <w:rPr>
@@ -2398,7 +2337,7 @@
           <w:noProof/>
         </w:rPr>
       </w:pPr>
-      <w:hyperlink w:anchor="_Toc239369627" w:history="1">
+      <w:hyperlink w:anchor="_Toc239372064" w:history="1">
         <w:r>
           <w:rPr>
             <w:rStyle w:val="Hyperlink"/>
@@ -2425,7 +2364,7 @@
             <w:noProof/>
             <w:webHidden/>
           </w:rPr>
-          <w:instrText xml:space="preserve"> PAGEREF _Toc239369627 \h </w:instrText>
+          <w:instrText xml:space="preserve"> PAGEREF _Toc239372064 \h </w:instrText>
         </w:r>
         <w:r>
           <w:rPr>
@@ -2466,7 +2405,7 @@
           <w:noProof/>
         </w:rPr>
       </w:pPr>
-      <w:hyperlink w:anchor="_Toc239369628" w:history="1">
+      <w:hyperlink w:anchor="_Toc239372065" w:history="1">
         <w:r>
           <w:rPr>
             <w:rStyle w:val="Hyperlink"/>
@@ -2493,7 +2432,7 @@
             <w:noProof/>
             <w:webHidden/>
           </w:rPr>
-          <w:instrText xml:space="preserve"> PAGEREF _Toc239369628 \h </w:instrText>
+          <w:instrText xml:space="preserve"> PAGEREF _Toc239372065 \h </w:instrText>
         </w:r>
         <w:r>
           <w:rPr>
@@ -2534,13 +2473,13 @@
           <w:noProof/>
         </w:rPr>
       </w:pPr>
-      <w:hyperlink w:anchor="_Toc239369629" w:history="1">
+      <w:hyperlink w:anchor="_Toc239372066" w:history="1">
         <w:r>
           <w:rPr>
             <w:rStyle w:val="Hyperlink"/>
             <w:noProof/>
           </w:rPr>
-          <w:t>9. Références et propriété</w:t>
+          <w:t>9. Références</w:t>
         </w:r>
         <w:r>
           <w:rPr>
@@ -2561,7 +2500,7 @@
             <w:noProof/>
             <w:webHidden/>
           </w:rPr>
-          <w:instrText xml:space="preserve"> PAGEREF _Toc239369629 \h </w:instrText>
+          <w:instrText xml:space="preserve"> PAGEREF _Toc239372066 \h </w:instrText>
         </w:r>
         <w:r>
           <w:rPr>
@@ -2606,7 +2545,7 @@
       <w:pPr>
         <w:pStyle w:val="Heading1"/>
       </w:pPr>
-      <w:bookmarkStart w:id="3" w:name="_Toc239369604"/>
+      <w:bookmarkStart w:id="3" w:name="_Toc239372041"/>
       <w:r>
         <w:lastRenderedPageBreak/>
         <w:t>1. Présentation générale</w:t>
@@ -2622,7 +2561,7 @@
       <w:pPr>
         <w:pStyle w:val="Heading2"/>
       </w:pPr>
-      <w:bookmarkStart w:id="4" w:name="_Toc239369605"/>
+      <w:bookmarkStart w:id="4" w:name="_Toc239372042"/>
       <w:r>
         <w:t>1.1 Fonctions principales</w:t>
       </w:r>
@@ -2696,7 +2635,7 @@
       <w:pPr>
         <w:pStyle w:val="Heading2"/>
       </w:pPr>
-      <w:bookmarkStart w:id="5" w:name="_Toc239369606"/>
+      <w:bookmarkStart w:id="5" w:name="_Toc239372043"/>
       <w:r>
         <w:t>1.2 Profils concernés</w:t>
       </w:r>
@@ -2716,7 +2655,7 @@
           <w:noProof/>
         </w:rPr>
         <w:drawing>
-          <wp:inline distT="0" distB="0" distL="0" distR="0" wp14:anchorId="23E89675" wp14:editId="2CE0C73E">
+          <wp:inline distT="0" distB="0" distL="0" distR="0" wp14:anchorId="159F5898" wp14:editId="1D1678D7">
             <wp:extent cx="5852160" cy="3657600"/>
             <wp:effectExtent l="0" t="0" r="0" b="0"/>
             <wp:docPr id="3" name="Picture 3"/>
@@ -2763,7 +2702,6 @@
     </w:p>
     <w:p>
       <w:r>
-        <w:lastRenderedPageBreak/>
         <w:br w:type="page"/>
       </w:r>
     </w:p>
@@ -2771,9 +2709,8 @@
       <w:pPr>
         <w:pStyle w:val="Heading1"/>
       </w:pPr>
-      <w:bookmarkStart w:id="6" w:name="_Toc239369607"/>
+      <w:bookmarkStart w:id="6" w:name="_Toc239372044"/>
       <w:r>
-        <w:lastRenderedPageBreak/>
         <w:t>2. Accès et authentification</w:t>
       </w:r>
       <w:bookmarkEnd w:id="6"/>
@@ -2782,7 +2719,7 @@
       <w:pPr>
         <w:pStyle w:val="Heading2"/>
       </w:pPr>
-      <w:bookmarkStart w:id="7" w:name="_Toc239369608"/>
+      <w:bookmarkStart w:id="7" w:name="_Toc239372045"/>
       <w:r>
         <w:t>2.1 Prérequis</w:t>
       </w:r>
@@ -2816,7 +2753,7 @@
       <w:pPr>
         <w:pStyle w:val="Heading2"/>
       </w:pPr>
-      <w:bookmarkStart w:id="8" w:name="_Toc239369609"/>
+      <w:bookmarkStart w:id="8" w:name="_Toc239372046"/>
       <w:r>
         <w:t>2.2 Connexion</w:t>
       </w:r>
@@ -2903,7 +2840,7 @@
           <w:noProof/>
         </w:rPr>
         <w:drawing>
-          <wp:inline distT="0" distB="0" distL="0" distR="0" wp14:anchorId="46486CF7" wp14:editId="63891898">
+          <wp:inline distT="0" distB="0" distL="0" distR="0" wp14:anchorId="02269DBC" wp14:editId="1E7DEFAB">
             <wp:extent cx="5806440" cy="3629025"/>
             <wp:effectExtent l="0" t="0" r="0" b="0"/>
             <wp:docPr id="4" name="Picture 4"/>
@@ -2957,9 +2894,8 @@
       <w:pPr>
         <w:pStyle w:val="Heading1"/>
       </w:pPr>
-      <w:bookmarkStart w:id="9" w:name="_Toc239369610"/>
+      <w:bookmarkStart w:id="9" w:name="_Toc239372047"/>
       <w:r>
-        <w:lastRenderedPageBreak/>
         <w:t>3. Gestion des documents</w:t>
       </w:r>
       <w:bookmarkEnd w:id="9"/>
@@ -2968,7 +2904,7 @@
       <w:pPr>
         <w:pStyle w:val="Heading2"/>
       </w:pPr>
-      <w:bookmarkStart w:id="10" w:name="_Toc239369611"/>
+      <w:bookmarkStart w:id="10" w:name="_Toc239372048"/>
       <w:r>
         <w:t>3.1 Consulter les documents</w:t>
       </w:r>
@@ -2988,7 +2924,7 @@
           <w:noProof/>
         </w:rPr>
         <w:drawing>
-          <wp:inline distT="0" distB="0" distL="0" distR="0" wp14:anchorId="1D816965" wp14:editId="08B509EF">
+          <wp:inline distT="0" distB="0" distL="0" distR="0" wp14:anchorId="606039B4" wp14:editId="6692A347">
             <wp:extent cx="5029200" cy="5147945"/>
             <wp:effectExtent l="0" t="0" r="0" b="0"/>
             <wp:docPr id="5" name="Picture 5"/>
@@ -3037,7 +2973,7 @@
       <w:pPr>
         <w:pStyle w:val="Heading2"/>
       </w:pPr>
-      <w:bookmarkStart w:id="11" w:name="_Toc239369612"/>
+      <w:bookmarkStart w:id="11" w:name="_Toc239372049"/>
       <w:r>
         <w:t>3.2 Déposer un document</w:t>
       </w:r>
@@ -3109,11 +3045,7 @@
               <w:t xml:space="preserve">Résultat attendu — </w:t>
             </w:r>
             <w:r>
-              <w:t xml:space="preserve">Le fichier est stocké dans MinIO, ses métadonnées sont enregistrées en base et </w:t>
-            </w:r>
-            <w:r>
-              <w:lastRenderedPageBreak/>
-              <w:t>les traitements asynchrones sont déclenchés automatiquement.</w:t>
+              <w:t>Le fichier est stocké dans MinIO, ses métadonnées sont enregistrées en base et les traitements asynchrones sont déclenchés automatiquement.</w:t>
             </w:r>
           </w:p>
         </w:tc>
@@ -3121,7 +3053,6 @@
     </w:tbl>
     <w:p>
       <w:r>
-        <w:lastRenderedPageBreak/>
         <w:br w:type="page"/>
       </w:r>
     </w:p>
@@ -3129,9 +3060,8 @@
       <w:pPr>
         <w:pStyle w:val="Heading2"/>
       </w:pPr>
-      <w:bookmarkStart w:id="12" w:name="_Toc239369613"/>
+      <w:bookmarkStart w:id="12" w:name="_Toc239372050"/>
       <w:r>
-        <w:lastRenderedPageBreak/>
         <w:t>3.3 Consulter la fiche détaillée</w:t>
       </w:r>
       <w:bookmarkEnd w:id="12"/>
@@ -3150,7 +3080,7 @@
           <w:noProof/>
         </w:rPr>
         <w:drawing>
-          <wp:inline distT="0" distB="0" distL="0" distR="0" wp14:anchorId="244AB8D1" wp14:editId="61A0FD18">
+          <wp:inline distT="0" distB="0" distL="0" distR="0" wp14:anchorId="228EC26C" wp14:editId="59C564BA">
             <wp:extent cx="5303520" cy="3756660"/>
             <wp:effectExtent l="0" t="0" r="0" b="0"/>
             <wp:docPr id="6" name="Picture 6"/>
@@ -3199,7 +3129,7 @@
       <w:pPr>
         <w:pStyle w:val="Heading2"/>
       </w:pPr>
-      <w:bookmarkStart w:id="13" w:name="_Toc239369614"/>
+      <w:bookmarkStart w:id="13" w:name="_Toc239372051"/>
       <w:r>
         <w:t>3.4 Télécharger, renommer ou supprimer</w:t>
       </w:r>
@@ -3278,9 +3208,8 @@
       <w:pPr>
         <w:pStyle w:val="Heading1"/>
       </w:pPr>
-      <w:bookmarkStart w:id="14" w:name="_Toc239369615"/>
+      <w:bookmarkStart w:id="14" w:name="_Toc239372052"/>
       <w:r>
-        <w:lastRenderedPageBreak/>
         <w:t>4. Suivi des traitements</w:t>
       </w:r>
       <w:bookmarkEnd w:id="14"/>
@@ -3289,7 +3218,7 @@
       <w:pPr>
         <w:pStyle w:val="Heading2"/>
       </w:pPr>
-      <w:bookmarkStart w:id="15" w:name="_Toc239369616"/>
+      <w:bookmarkStart w:id="15" w:name="_Toc239372053"/>
       <w:r>
         <w:t>4.1 Piste d’audit</w:t>
       </w:r>
@@ -3309,7 +3238,7 @@
           <w:noProof/>
         </w:rPr>
         <w:drawing>
-          <wp:inline distT="0" distB="0" distL="0" distR="0" wp14:anchorId="781A7362" wp14:editId="29C9657F">
+          <wp:inline distT="0" distB="0" distL="0" distR="0" wp14:anchorId="04B615F5" wp14:editId="5874F812">
             <wp:extent cx="5212080" cy="3952494"/>
             <wp:effectExtent l="0" t="0" r="0" b="0"/>
             <wp:docPr id="7" name="Picture 7"/>
@@ -3358,7 +3287,7 @@
       <w:pPr>
         <w:pStyle w:val="Heading2"/>
       </w:pPr>
-      <w:bookmarkStart w:id="16" w:name="_Toc239369617"/>
+      <w:bookmarkStart w:id="16" w:name="_Toc239372054"/>
       <w:r>
         <w:t>4.2 Notifications</w:t>
       </w:r>
@@ -3377,9 +3306,8 @@
         <w:rPr>
           <w:noProof/>
         </w:rPr>
-        <w:lastRenderedPageBreak/>
         <w:drawing>
-          <wp:inline distT="0" distB="0" distL="0" distR="0" wp14:anchorId="2E478C62" wp14:editId="09E15DE0">
+          <wp:inline distT="0" distB="0" distL="0" distR="0" wp14:anchorId="1A5DC0DA" wp14:editId="19BC3DC5">
             <wp:extent cx="5212080" cy="3952494"/>
             <wp:effectExtent l="0" t="0" r="0" b="0"/>
             <wp:docPr id="8" name="Picture 8"/>
@@ -3433,9 +3361,8 @@
       <w:pPr>
         <w:pStyle w:val="Heading2"/>
       </w:pPr>
-      <w:bookmarkStart w:id="17" w:name="_Toc239369618"/>
+      <w:bookmarkStart w:id="17" w:name="_Toc239372055"/>
       <w:r>
-        <w:lastRenderedPageBreak/>
         <w:t>4.3 Intégrité</w:t>
       </w:r>
       <w:bookmarkEnd w:id="17"/>
@@ -3454,7 +3381,7 @@
           <w:noProof/>
         </w:rPr>
         <w:drawing>
-          <wp:inline distT="0" distB="0" distL="0" distR="0" wp14:anchorId="25DB1EC9" wp14:editId="6238D8A3">
+          <wp:inline distT="0" distB="0" distL="0" distR="0" wp14:anchorId="659A687C" wp14:editId="6FA7468B">
             <wp:extent cx="5212080" cy="3869245"/>
             <wp:effectExtent l="0" t="0" r="0" b="0"/>
             <wp:docPr id="9" name="Picture 9"/>
@@ -3503,7 +3430,7 @@
       <w:pPr>
         <w:pStyle w:val="Heading2"/>
       </w:pPr>
-      <w:bookmarkStart w:id="18" w:name="_Toc239369619"/>
+      <w:bookmarkStart w:id="18" w:name="_Toc239372056"/>
       <w:r>
         <w:t>4.4 Alertes de sécurité</w:t>
       </w:r>
@@ -3522,9 +3449,8 @@
         <w:rPr>
           <w:noProof/>
         </w:rPr>
-        <w:lastRenderedPageBreak/>
         <w:drawing>
-          <wp:inline distT="0" distB="0" distL="0" distR="0" wp14:anchorId="39DBDA54" wp14:editId="42539EAF">
+          <wp:inline distT="0" distB="0" distL="0" distR="0" wp14:anchorId="7F4A391B" wp14:editId="5D7DAF54">
             <wp:extent cx="5212080" cy="3257550"/>
             <wp:effectExtent l="0" t="0" r="0" b="0"/>
             <wp:docPr id="10" name="Picture 10"/>
@@ -3578,9 +3504,8 @@
       <w:pPr>
         <w:pStyle w:val="Heading1"/>
       </w:pPr>
-      <w:bookmarkStart w:id="19" w:name="_Toc239369620"/>
+      <w:bookmarkStart w:id="19" w:name="_Toc239372057"/>
       <w:r>
-        <w:lastRenderedPageBreak/>
         <w:t>5. Interfaces techniques de contrôle</w:t>
       </w:r>
       <w:bookmarkEnd w:id="19"/>
@@ -3589,7 +3514,7 @@
       <w:pPr>
         <w:pStyle w:val="Heading2"/>
       </w:pPr>
-      <w:bookmarkStart w:id="20" w:name="_Toc239369621"/>
+      <w:bookmarkStart w:id="20" w:name="_Toc239372058"/>
       <w:r>
         <w:t>5.1 Documentation des API</w:t>
       </w:r>
@@ -3609,7 +3534,7 @@
           <w:noProof/>
         </w:rPr>
         <w:drawing>
-          <wp:inline distT="0" distB="0" distL="0" distR="0" wp14:anchorId="1CFB7512" wp14:editId="75C6F0AD">
+          <wp:inline distT="0" distB="0" distL="0" distR="0" wp14:anchorId="39BC005C" wp14:editId="7C6690E6">
             <wp:extent cx="5029200" cy="4644152"/>
             <wp:effectExtent l="0" t="0" r="0" b="0"/>
             <wp:docPr id="11" name="Picture 11"/>
@@ -3658,7 +3583,7 @@
       <w:pPr>
         <w:pStyle w:val="Heading2"/>
       </w:pPr>
-      <w:bookmarkStart w:id="21" w:name="_Toc239369622"/>
+      <w:bookmarkStart w:id="21" w:name="_Toc239372059"/>
       <w:r>
         <w:t>5.2 Supervision du flux Kafka</w:t>
       </w:r>
@@ -3677,9 +3602,8 @@
         <w:rPr>
           <w:noProof/>
         </w:rPr>
-        <w:lastRenderedPageBreak/>
         <w:drawing>
-          <wp:inline distT="0" distB="0" distL="0" distR="0" wp14:anchorId="6C0C2571" wp14:editId="29053EFD">
+          <wp:inline distT="0" distB="0" distL="0" distR="0" wp14:anchorId="05D1D2B3" wp14:editId="5D8CDC57">
             <wp:extent cx="5669280" cy="2726696"/>
             <wp:effectExtent l="0" t="0" r="0" b="0"/>
             <wp:docPr id="12" name="Picture 12"/>
@@ -3733,9 +3657,8 @@
       <w:pPr>
         <w:pStyle w:val="Heading2"/>
       </w:pPr>
-      <w:bookmarkStart w:id="22" w:name="_Toc239369623"/>
+      <w:bookmarkStart w:id="22" w:name="_Toc239372060"/>
       <w:r>
-        <w:lastRenderedPageBreak/>
         <w:t>5.3 Groupes de consommateurs et rejeu</w:t>
       </w:r>
       <w:bookmarkEnd w:id="22"/>
@@ -3754,7 +3677,7 @@
           <w:noProof/>
         </w:rPr>
         <w:drawing>
-          <wp:inline distT="0" distB="0" distL="0" distR="0" wp14:anchorId="494E28C8" wp14:editId="567F5553">
+          <wp:inline distT="0" distB="0" distL="0" distR="0" wp14:anchorId="7FEDE219" wp14:editId="6407D9E2">
             <wp:extent cx="5715000" cy="3571875"/>
             <wp:effectExtent l="0" t="0" r="0" b="0"/>
             <wp:docPr id="13" name="Picture 13"/>
@@ -3803,7 +3726,7 @@
       <w:pPr>
         <w:pStyle w:val="Heading2"/>
       </w:pPr>
-      <w:bookmarkStart w:id="23" w:name="_Toc239369624"/>
+      <w:bookmarkStart w:id="23" w:name="_Toc239372061"/>
       <w:r>
         <w:t>5.4 Stockage objet</w:t>
       </w:r>
@@ -3822,9 +3745,8 @@
         <w:rPr>
           <w:noProof/>
         </w:rPr>
-        <w:lastRenderedPageBreak/>
         <w:drawing>
-          <wp:inline distT="0" distB="0" distL="0" distR="0" wp14:anchorId="6DF934BB" wp14:editId="0C68D323">
+          <wp:inline distT="0" distB="0" distL="0" distR="0" wp14:anchorId="1C3E963C" wp14:editId="28163B30">
             <wp:extent cx="5715000" cy="2770819"/>
             <wp:effectExtent l="0" t="0" r="0" b="0"/>
             <wp:docPr id="14" name="Picture 14"/>
@@ -3878,9 +3800,8 @@
       <w:pPr>
         <w:pStyle w:val="Heading2"/>
       </w:pPr>
-      <w:bookmarkStart w:id="24" w:name="_Toc239369625"/>
+      <w:bookmarkStart w:id="24" w:name="_Toc239372062"/>
       <w:r>
-        <w:lastRenderedPageBreak/>
         <w:t>5.5 Contrôle des courriels</w:t>
       </w:r>
       <w:bookmarkEnd w:id="24"/>
@@ -3899,7 +3820,7 @@
           <w:noProof/>
         </w:rPr>
         <w:drawing>
-          <wp:inline distT="0" distB="0" distL="0" distR="0" wp14:anchorId="2C789A17" wp14:editId="29BC3CEC">
+          <wp:inline distT="0" distB="0" distL="0" distR="0" wp14:anchorId="77E96D89" wp14:editId="511C1D73">
             <wp:extent cx="5715000" cy="3571875"/>
             <wp:effectExtent l="0" t="0" r="0" b="0"/>
             <wp:docPr id="15" name="Picture 15"/>
@@ -3948,7 +3869,7 @@
       <w:pPr>
         <w:pStyle w:val="Heading1"/>
       </w:pPr>
-      <w:bookmarkStart w:id="25" w:name="_Toc239369626"/>
+      <w:bookmarkStart w:id="25" w:name="_Toc239372063"/>
       <w:r>
         <w:t>6. Scénario de démonstration recommandé</w:t>
       </w:r>
@@ -4067,9 +3988,8 @@
       <w:pPr>
         <w:pStyle w:val="Heading1"/>
       </w:pPr>
-      <w:bookmarkStart w:id="26" w:name="_Toc239369627"/>
+      <w:bookmarkStart w:id="26" w:name="_Toc239372064"/>
       <w:r>
-        <w:lastRenderedPageBreak/>
         <w:t>7. Résolution des problèmes fréquents</w:t>
       </w:r>
       <w:bookmarkEnd w:id="26"/>
@@ -4418,7 +4338,7 @@
       <w:pPr>
         <w:pStyle w:val="Heading1"/>
       </w:pPr>
-      <w:bookmarkStart w:id="27" w:name="_Toc239369628"/>
+      <w:bookmarkStart w:id="27" w:name="_Toc239372065"/>
       <w:r>
         <w:t>8. Bonnes pratiques</w:t>
       </w:r>
@@ -4476,9 +4396,9 @@
       <w:pPr>
         <w:pStyle w:val="Heading1"/>
       </w:pPr>
-      <w:bookmarkStart w:id="28" w:name="_Toc239369629"/>
+      <w:bookmarkStart w:id="28" w:name="_Toc239372066"/>
       <w:r>
-        <w:t>9. Références et propriété</w:t>
+        <w:t>9. Références</w:t>
       </w:r>
       <w:bookmarkEnd w:id="28"/>
     </w:p>
@@ -4499,7 +4419,6 @@
     </w:p>
     <w:p>
       <w:r>
-        <w:lastRenderedPageBreak/>
         <w:t xml:space="preserve">Dépôt GitHub officiel : </w:t>
       </w:r>
       <w:hyperlink r:id="rId23">
@@ -4511,11 +4430,6 @@
           <w:t>https://github.com/Wvssim/cdc-streaming-pipeline</w:t>
         </w:r>
       </w:hyperlink>
-    </w:p>
-    <w:p>
-      <w:r>
-        <w:t>Toute copie ou adaptation doit conserver une attribution explicite à l’auteur et une référence au dépôt officiel. Les noms et marques des technologies et organismes cités restent la propriété de leurs détenteurs respectifs.</w:t>
-      </w:r>
     </w:p>
     <w:tbl>
       <w:tblPr>
@@ -4613,7 +4527,7 @@
             <w:rPr>
               <w:sz w:val="16"/>
             </w:rPr>
-            <w:t>© 2026 Lazim Wassim · https://github.com/Wvssim/cdc-streaming-pipeline</w:t>
+            <w:t>© 2026 Lazim Wassim · GitHub : Wvssim</w:t>
           </w:r>
         </w:p>
       </w:tc>
@@ -4869,31 +4783,31 @@
       </w:rPr>
     </w:lvl>
   </w:abstractNum>
-  <w:num w:numId="1" w16cid:durableId="1289162420">
+  <w:num w:numId="1" w16cid:durableId="753278697">
     <w:abstractNumId w:val="8"/>
   </w:num>
-  <w:num w:numId="2" w16cid:durableId="1146817244">
+  <w:num w:numId="2" w16cid:durableId="1786147018">
     <w:abstractNumId w:val="6"/>
   </w:num>
-  <w:num w:numId="3" w16cid:durableId="138041500">
+  <w:num w:numId="3" w16cid:durableId="2019192584">
     <w:abstractNumId w:val="5"/>
   </w:num>
-  <w:num w:numId="4" w16cid:durableId="1896164081">
+  <w:num w:numId="4" w16cid:durableId="1188256558">
     <w:abstractNumId w:val="4"/>
   </w:num>
-  <w:num w:numId="5" w16cid:durableId="929387343">
+  <w:num w:numId="5" w16cid:durableId="1644700383">
     <w:abstractNumId w:val="7"/>
   </w:num>
-  <w:num w:numId="6" w16cid:durableId="1851605729">
+  <w:num w:numId="6" w16cid:durableId="351536231">
     <w:abstractNumId w:val="3"/>
   </w:num>
-  <w:num w:numId="7" w16cid:durableId="986782010">
+  <w:num w:numId="7" w16cid:durableId="1657030907">
     <w:abstractNumId w:val="2"/>
   </w:num>
-  <w:num w:numId="8" w16cid:durableId="558787222">
+  <w:num w:numId="8" w16cid:durableId="654795230">
     <w:abstractNumId w:val="1"/>
   </w:num>
-  <w:num w:numId="9" w16cid:durableId="1122768474">
+  <w:num w:numId="9" w16cid:durableId="1066999296">
     <w:abstractNumId w:val="0"/>
   </w:num>
 </w:numbering>
@@ -16295,7 +16209,7 @@
     <w:autoRedefine/>
     <w:uiPriority w:val="39"/>
     <w:unhideWhenUsed/>
-    <w:rsid w:val="0069652E"/>
+    <w:rsid w:val="00384FE9"/>
     <w:pPr>
       <w:spacing w:after="100"/>
     </w:pPr>
@@ -16307,7 +16221,7 @@
     <w:autoRedefine/>
     <w:uiPriority w:val="39"/>
     <w:unhideWhenUsed/>
-    <w:rsid w:val="0069652E"/>
+    <w:rsid w:val="00384FE9"/>
     <w:pPr>
       <w:spacing w:after="100"/>
       <w:ind w:left="240"/>
@@ -16318,7 +16232,7 @@
     <w:basedOn w:val="DefaultParagraphFont"/>
     <w:uiPriority w:val="99"/>
     <w:unhideWhenUsed/>
-    <w:rsid w:val="0069652E"/>
+    <w:rsid w:val="00384FE9"/>
     <w:rPr>
       <w:color w:val="0000FF" w:themeColor="hyperlink"/>
       <w:u w:val="single"/>

</xml_diff>